<commit_message>
Add generate_surat_pernyataan.py and SPTJM generation feature to dashboard
</commit_message>
<xml_diff>
--- a/_usulan_tpp_smkn1_koba/PNS/SURAT PERNYATAAN PNS.docx
+++ b/_usulan_tpp_smkn1_koba/PNS/SURAT PERNYATAAN PNS.docx
@@ -144,10 +144,10 @@
       </w:pPr>
       <w:r>
         <w:drawing>
-          <wp:inline distT="0" distB="0" distL="0" distR="0" wp14:anchorId="2D86F87E" wp14:editId="28F198DF">
-            <wp:extent cx="5746750" cy="6413500"/>
-            <wp:effectExtent l="0" t="0" r="6350" b="0"/>
-            <wp:docPr id="4" name="Picture 4"/>
+          <wp:inline distT="0" distB="0" distL="0" distR="0" wp14:anchorId="00335188" wp14:editId="0396ECE2">
+            <wp:extent cx="5943600" cy="6644640"/>
+            <wp:effectExtent l="0" t="0" r="0" b="3810"/>
+            <wp:docPr id="1" name="Picture 1"/>
             <wp:cNvGraphicFramePr>
               <a:graphicFrameLocks xmlns:a="http://schemas.openxmlformats.org/drawingml/2006/main" noChangeAspect="1"/>
             </wp:cNvGraphicFramePr>
@@ -155,7 +155,7 @@
               <a:graphicData uri="http://schemas.openxmlformats.org/drawingml/2006/picture">
                 <pic:pic xmlns:pic="http://schemas.openxmlformats.org/drawingml/2006/picture">
                   <pic:nvPicPr>
-                    <pic:cNvPr id="0" name="Picture 3"/>
+                    <pic:cNvPr id="0" name="Picture 1"/>
                     <pic:cNvPicPr>
                       <a:picLocks noChangeAspect="1" noChangeArrowheads="1"/>
                     </pic:cNvPicPr>
@@ -176,7 +176,7 @@
                   <pic:spPr bwMode="auto">
                     <a:xfrm>
                       <a:off x="0" y="0"/>
-                      <a:ext cx="5746750" cy="6413500"/>
+                      <a:ext cx="5943600" cy="6644640"/>
                     </a:xfrm>
                     <a:prstGeom prst="rect">
                       <a:avLst/>

</xml_diff>